<commit_message>
Corrige materia y respuesta de clasificación en Actividad 15
- Nombre de la materia corregido: "Informática Criminológica" -> "CNO IV · Programación WAP" (header, ficha técnica, footer, tarjeta de index)
- Respuesta de Parte I #1 corregida: la clasificación de INTERPOL es la propiedad InterpolClassification = "Unclassified" en docProps/custom.xml, no cp:category = "English"
- Documentos descargables (.docx/.pdf) actualizados con la corrección

Co-Authored-By: Claude Sonnet 5 <noreply@anthropic.com>
Claude-Session: https://claude.ai/code/session_01TtwbefYM6iHJCvXdovtevq
</commit_message>
<xml_diff>
--- a/assets/evidencias/parcial-1/actividad-15/Actividad15_MetadatosForenses_Juan_Ortega.docx
+++ b/assets/evidencias/parcial-1/actividad-15/Actividad15_MetadatosForenses_Juan_Ortega.docx
@@ -231,7 +231,13 @@
           <w:i/>
           <w:sz w:val="22"/>
         </w:rPr>
-        <w:t>Fue categorizado como “English” (campo Category / cp:category = “English” en docProps/core.xml).</w:t>
+      </w:r>
+      <w:r>
+        <w:rPr>
+          <w:i/>
+          <w:sz w:val="22"/>
+        </w:rPr>
+        <w:t>Unclassified (propiedad personalizada InterpolClassification en docProps/custom.xml, el campo que INTERPOL usa para clasificar el documento; no confundir con cp:category = “English”, que es el idioma/categoría genérica del documento).</w:t>
       </w:r>
     </w:p>
     <w:p>

</xml_diff>

<commit_message>
Agrega sección de Evidencias con capturas de ExifTool a Actividad 15
- Nueva sección "06 / EVIDENCIAS" en actividad-15.html con 6 capturas reales de exiftool.exe (cmd), Google Maps y verificación del saneamiento
- Mismas 6 capturas insertadas como anexo "Parte III. Evidencias" en el reporte .docx/.pdf
- Renumeración de las secciones de archivos entregables (07) y conclusión (08)

Co-Authored-By: Claude Sonnet 5 <noreply@anthropic.com>
Claude-Session: https://claude.ai/code/session_01TtwbefYM6iHJCvXdovtevq
</commit_message>
<xml_diff>
--- a/assets/evidencias/parcial-1/actividad-15/Actividad15_MetadatosForenses_Juan_Ortega.docx
+++ b/assets/evidencias/parcial-1/actividad-15/Actividad15_MetadatosForenses_Juan_Ortega.docx
@@ -859,6 +859,311 @@
           <w:rFonts w:ascii="Segoe UI" w:hAnsi="Segoe UI" w:cs="Segoe UI"/>
         </w:rPr>
       </w:pPr>
+    </w:p>
+    <w:p>
+      <w:r>
+        <w:rPr>
+          <w:rFonts w:ascii="Segoe UI" w:hAnsi="Segoe UI"/>
+          <w:b/>
+        </w:rPr>
+        <w:t>Parte III. Evidencias: capturas del proceso con ExifTool</w:t>
+      </w:r>
+    </w:p>
+    <w:p>
+      <w:r>
+        <w:rPr>
+          <w:sz w:val="20"/>
+        </w:rPr>
+        <w:t>Comandos ejecutados directamente en cmd con exiftool.exe sobre las dos muestras, verificación de la ubicación GPS en Google Maps y confirmación del saneamiento de la fotografía.</w:t>
+      </w:r>
+    </w:p>
+    <w:p>
+      <w:pPr>
+        <w:jc w:val="center"/>
+      </w:pPr>
+      <w:r>
+        <w:drawing>
+          <wp:inline xmlns:a="http://schemas.openxmlformats.org/drawingml/2006/main" xmlns:pic="http://schemas.openxmlformats.org/drawingml/2006/picture">
+            <wp:extent cx="5029200" cy="2801471"/>
+            <wp:docPr id="1" name="Picture 1"/>
+            <wp:cNvGraphicFramePr>
+              <a:graphicFrameLocks noChangeAspect="1"/>
+            </wp:cNvGraphicFramePr>
+            <a:graphic>
+              <a:graphicData uri="http://schemas.openxmlformats.org/drawingml/2006/picture">
+                <pic:pic>
+                  <pic:nvPicPr>
+                    <pic:cNvPr id="0" name="01-docx-metadatos-interpol.png"/>
+                    <pic:cNvPicPr/>
+                  </pic:nvPicPr>
+                  <pic:blipFill>
+                    <a:blip r:embed="rId12"/>
+                    <a:stretch>
+                      <a:fillRect/>
+                    </a:stretch>
+                  </pic:blipFill>
+                  <pic:spPr>
+                    <a:xfrm>
+                      <a:off x="0" y="0"/>
+                      <a:ext cx="5029200" cy="2801471"/>
+                    </a:xfrm>
+                    <a:prstGeom prst="rect"/>
+                  </pic:spPr>
+                </pic:pic>
+              </a:graphicData>
+            </a:graphic>
+          </wp:inline>
+        </w:drawing>
+      </w:r>
+    </w:p>
+    <w:p>
+      <w:r>
+        <w:rPr>
+          <w:i/>
+          <w:sz w:val="18"/>
+        </w:rPr>
+        <w:t>Fig. 1 — exiftool.exe "WOA database application form.docx" — clasificación INTERPOL (InterpolClassification: Unclassified) y propiedades OOXML (Template, Company, Creator, Last Modified By, Create Date).</w:t>
+      </w:r>
+    </w:p>
+    <w:p>
+      <w:pPr>
+        <w:jc w:val="center"/>
+      </w:pPr>
+      <w:r>
+        <w:drawing>
+          <wp:inline xmlns:a="http://schemas.openxmlformats.org/drawingml/2006/main" xmlns:pic="http://schemas.openxmlformats.org/drawingml/2006/picture">
+            <wp:extent cx="5029200" cy="2801471"/>
+            <wp:docPr id="2" name="Picture 2"/>
+            <wp:cNvGraphicFramePr>
+              <a:graphicFrameLocks noChangeAspect="1"/>
+            </wp:cNvGraphicFramePr>
+            <a:graphic>
+              <a:graphicData uri="http://schemas.openxmlformats.org/drawingml/2006/picture">
+                <pic:pic>
+                  <pic:nvPicPr>
+                    <pic:cNvPr id="0" name="02-jpg-exif-camara.png"/>
+                    <pic:cNvPicPr/>
+                  </pic:nvPicPr>
+                  <pic:blipFill>
+                    <a:blip r:embed="rId13"/>
+                    <a:stretch>
+                      <a:fillRect/>
+                    </a:stretch>
+                  </pic:blipFill>
+                  <pic:spPr>
+                    <a:xfrm>
+                      <a:off x="0" y="0"/>
+                      <a:ext cx="5029200" cy="2801471"/>
+                    </a:xfrm>
+                    <a:prstGeom prst="rect"/>
+                  </pic:spPr>
+                </pic:pic>
+              </a:graphicData>
+            </a:graphic>
+          </wp:inline>
+        </w:drawing>
+      </w:r>
+    </w:p>
+    <w:p>
+      <w:r>
+        <w:rPr>
+          <w:i/>
+          <w:sz w:val="18"/>
+        </w:rPr>
+        <w:t>Fig. 2 — exiftool.exe XiaomiMiA2Lite.jpg — ISO, longitud focal y flash.</w:t>
+      </w:r>
+    </w:p>
+    <w:p>
+      <w:pPr>
+        <w:jc w:val="center"/>
+      </w:pPr>
+      <w:r>
+        <w:drawing>
+          <wp:inline xmlns:a="http://schemas.openxmlformats.org/drawingml/2006/main" xmlns:pic="http://schemas.openxmlformats.org/drawingml/2006/picture">
+            <wp:extent cx="5029200" cy="2801471"/>
+            <wp:docPr id="3" name="Picture 3"/>
+            <wp:cNvGraphicFramePr>
+              <a:graphicFrameLocks noChangeAspect="1"/>
+            </wp:cNvGraphicFramePr>
+            <a:graphic>
+              <a:graphicData uri="http://schemas.openxmlformats.org/drawingml/2006/picture">
+                <pic:pic>
+                  <pic:nvPicPr>
+                    <pic:cNvPr id="0" name="03-jpg-exif-gps.png"/>
+                    <pic:cNvPicPr/>
+                  </pic:nvPicPr>
+                  <pic:blipFill>
+                    <a:blip r:embed="rId14"/>
+                    <a:stretch>
+                      <a:fillRect/>
+                    </a:stretch>
+                  </pic:blipFill>
+                  <pic:spPr>
+                    <a:xfrm>
+                      <a:off x="0" y="0"/>
+                      <a:ext cx="5029200" cy="2801471"/>
+                    </a:xfrm>
+                    <a:prstGeom prst="rect"/>
+                  </pic:spPr>
+                </pic:pic>
+              </a:graphicData>
+            </a:graphic>
+          </wp:inline>
+        </w:drawing>
+      </w:r>
+    </w:p>
+    <w:p>
+      <w:r>
+        <w:rPr>
+          <w:i/>
+          <w:sz w:val="18"/>
+        </w:rPr>
+        <w:t>Fig. 3 — Bloque GPS de exiftool.exe sobre XiaomiMiA2Lite.jpg: GPS Latitude, GPS Longitude y GPS Altitude.</w:t>
+      </w:r>
+    </w:p>
+    <w:p>
+      <w:pPr>
+        <w:jc w:val="center"/>
+      </w:pPr>
+      <w:r>
+        <w:drawing>
+          <wp:inline xmlns:a="http://schemas.openxmlformats.org/drawingml/2006/main" xmlns:pic="http://schemas.openxmlformats.org/drawingml/2006/picture">
+            <wp:extent cx="5029200" cy="2827778"/>
+            <wp:docPr id="4" name="Picture 4"/>
+            <wp:cNvGraphicFramePr>
+              <a:graphicFrameLocks noChangeAspect="1"/>
+            </wp:cNvGraphicFramePr>
+            <a:graphic>
+              <a:graphicData uri="http://schemas.openxmlformats.org/drawingml/2006/picture">
+                <pic:pic>
+                  <pic:nvPicPr>
+                    <pic:cNvPr id="0" name="04-google-maps-ubicacion.png"/>
+                    <pic:cNvPicPr/>
+                  </pic:nvPicPr>
+                  <pic:blipFill>
+                    <a:blip r:embed="rId15"/>
+                    <a:stretch>
+                      <a:fillRect/>
+                    </a:stretch>
+                  </pic:blipFill>
+                  <pic:spPr>
+                    <a:xfrm>
+                      <a:off x="0" y="0"/>
+                      <a:ext cx="5029200" cy="2827778"/>
+                    </a:xfrm>
+                    <a:prstGeom prst="rect"/>
+                  </pic:spPr>
+                </pic:pic>
+              </a:graphicData>
+            </a:graphic>
+          </wp:inline>
+        </w:drawing>
+      </w:r>
+    </w:p>
+    <w:p>
+      <w:r>
+        <w:rPr>
+          <w:i/>
+          <w:sz w:val="18"/>
+        </w:rPr>
+        <w:t>Fig. 4 — Coordenadas verificadas en Google Maps: Merrow, Guildford, Surrey, Reino Unido.</w:t>
+      </w:r>
+    </w:p>
+    <w:p>
+      <w:pPr>
+        <w:jc w:val="center"/>
+      </w:pPr>
+      <w:r>
+        <w:drawing>
+          <wp:inline xmlns:a="http://schemas.openxmlformats.org/drawingml/2006/main" xmlns:pic="http://schemas.openxmlformats.org/drawingml/2006/picture">
+            <wp:extent cx="5029200" cy="2827778"/>
+            <wp:docPr id="5" name="Picture 5"/>
+            <wp:cNvGraphicFramePr>
+              <a:graphicFrameLocks noChangeAspect="1"/>
+            </wp:cNvGraphicFramePr>
+            <a:graphic>
+              <a:graphicData uri="http://schemas.openxmlformats.org/drawingml/2006/picture">
+                <pic:pic>
+                  <pic:nvPicPr>
+                    <pic:cNvPr id="0" name="05-google-maps-acercamiento.png"/>
+                    <pic:cNvPicPr/>
+                  </pic:nvPicPr>
+                  <pic:blipFill>
+                    <a:blip r:embed="rId16"/>
+                    <a:stretch>
+                      <a:fillRect/>
+                    </a:stretch>
+                  </pic:blipFill>
+                  <pic:spPr>
+                    <a:xfrm>
+                      <a:off x="0" y="0"/>
+                      <a:ext cx="5029200" cy="2827778"/>
+                    </a:xfrm>
+                    <a:prstGeom prst="rect"/>
+                  </pic:spPr>
+                </pic:pic>
+              </a:graphicData>
+            </a:graphic>
+          </wp:inline>
+        </w:drawing>
+      </w:r>
+    </w:p>
+    <w:p>
+      <w:r>
+        <w:rPr>
+          <w:i/>
+          <w:sz w:val="18"/>
+        </w:rPr>
+        <w:t>Fig. 5 — Acercamiento en Google Maps al punto exacto señalado por el GPS.</w:t>
+      </w:r>
+    </w:p>
+    <w:p>
+      <w:pPr>
+        <w:jc w:val="center"/>
+      </w:pPr>
+      <w:r>
+        <w:drawing>
+          <wp:inline xmlns:a="http://schemas.openxmlformats.org/drawingml/2006/main" xmlns:pic="http://schemas.openxmlformats.org/drawingml/2006/picture">
+            <wp:extent cx="5029200" cy="2801471"/>
+            <wp:docPr id="6" name="Picture 6"/>
+            <wp:cNvGraphicFramePr>
+              <a:graphicFrameLocks noChangeAspect="1"/>
+            </wp:cNvGraphicFramePr>
+            <a:graphic>
+              <a:graphicData uri="http://schemas.openxmlformats.org/drawingml/2006/picture">
+                <pic:pic>
+                  <pic:nvPicPr>
+                    <pic:cNvPr id="0" name="06-eliminacion-y-verificacion-metadatos.png"/>
+                    <pic:cNvPicPr/>
+                  </pic:nvPicPr>
+                  <pic:blipFill>
+                    <a:blip r:embed="rId17"/>
+                    <a:stretch>
+                      <a:fillRect/>
+                    </a:stretch>
+                  </pic:blipFill>
+                  <pic:spPr>
+                    <a:xfrm>
+                      <a:off x="0" y="0"/>
+                      <a:ext cx="5029200" cy="2801471"/>
+                    </a:xfrm>
+                    <a:prstGeom prst="rect"/>
+                  </pic:spPr>
+                </pic:pic>
+              </a:graphicData>
+            </a:graphic>
+          </wp:inline>
+        </w:drawing>
+      </w:r>
+    </w:p>
+    <w:p>
+      <w:r>
+        <w:rPr>
+          <w:i/>
+          <w:sz w:val="18"/>
+        </w:rPr>
+        <w:t>Fig. 6 — exiftool.exe -all= sobre la copia de la fotografía ("1 image files updated") y verificación posterior: 0 etiquetas Exif/GPS tras el saneamiento.</w:t>
+      </w:r>
     </w:p>
     <w:sectPr>
       <w:headerReference w:type="default" r:id="rId7"/>

</xml_diff>